<commit_message>
Submission package complete: paper + cover letter for J. Complex Networks
Paper updates (compliance with COMNET author guidelines):
- Funding section added (no external funding, independent research)
- Alt text added for all 4 figures (OUP accessibility policy)
- [dataset] tag added to Zenodo ref [4] (Force11 data citation)
- ORCID field flagged for insertion before submission

Cover letter (cover_letter_comnet.txt):
- Addressed to COMNET editors
- 3 main findings stated with stats
- Suggested reviewers: Fortunato, Latora, Moreno
- Preprint/data availability disclosed
- Submission site: mc.manuscriptcentral.com/comnet

BLOCKING before submission: ORCID iD (orcid.org, free registration)
</commit_message>
<xml_diff>
--- a/papers/snt_oxford_submission.docx
+++ b/papers/snt_oxford_submission.docx
@@ -71,7 +71,7 @@
           <w:sz w:val="24"/>
           <w:szCs w:val="24"/>
         </w:rPr>
-        <w:t xml:space="preserve">ORCID: (pending registration)</w:t>
+        <w:t>ORCID: [INSERT ORCID BEFORE SUBMISSION — register free at orcid.org]</w:t>
       </w:r>
     </w:p>
     <w:p>
@@ -2786,6 +2786,15 @@
       </w:r>
     </w:p>
     <w:p>
+      <w:r>
+        <w:rPr>
+          <w:i/>
+          <w:sz w:val="18"/>
+        </w:rPr>
+        <w:t>Alt text: Four-panel figure showing power-law satellization dynamics across 502 cases. (A) Box plot of exponent b by domain. (B) Log-log scatter for four representative cases with fitted power-law lines. (C) b distributions for abrupt versus gradual triggers. (D) Histogram of full b-value distribution.</w:t>
+      </w:r>
+    </w:p>
+    <w:p>
       <w:pPr>
         <w:spacing w:after="0" w:line="480"/>
       </w:pPr>
@@ -2844,6 +2853,15 @@
       </w:r>
     </w:p>
     <w:p>
+      <w:r>
+        <w:rPr>
+          <w:i/>
+          <w:sz w:val="18"/>
+        </w:rPr>
+        <w:t>Alt text: Four-panel figure showing institutional friction as predictor of satellization velocity. (A) Mean b versus friction score by domain. (B) Individual case scatter. (C) Biological domains E1–E3. (D) Astrophysical domains F1–F4.</w:t>
+      </w:r>
+    </w:p>
+    <w:p>
       <w:pPr>
         <w:spacing w:after="0" w:line="480"/>
       </w:pPr>
@@ -2929,6 +2947,15 @@
           <w:szCs w:val="24"/>
         </w:rPr>
         <w:t xml:space="preserve">N-body matrix of the Mexican national system (INEGI 2022, 32 federal entities). (A) Log-log scatter of GDP per capita against rank. Power-law fit: f(r) = 396.8 × r^(−0.473), R² = 0.838, p &lt; 0.001. (B) GDP per capita distribution by SNT five-level taxonomy. (C) Tlaxcala composite gradient: binary model underestimated total satellization by 9.3×.</w:t>
+      </w:r>
+    </w:p>
+    <w:p>
+      <w:r>
+        <w:rPr>
+          <w:i/>
+          <w:sz w:val="18"/>
+        </w:rPr>
+        <w:t>Alt text: Four-panel figure showing N-body matrix of Mexican national system. (A) Log-log scatter GDP per capita versus rank, 32 federal entities, power-law fit R²=0.838. (B) Choropleth map of Mexico by satellization level. (C) Binary versus N-body model comparison. (D) ASI distribution by orbital level.</w:t>
       </w:r>
     </w:p>
     <w:p>
@@ -3492,6 +3519,15 @@
       </w:r>
     </w:p>
     <w:p>
+      <w:r>
+        <w:rPr>
+          <w:i/>
+          <w:sz w:val="18"/>
+        </w:rPr>
+        <w:t>Alt text: Four-panel figure showing Atomic Sovereignty Index on HackerEarth 2026 data. (A) ASI histogram with thresholds at 0.10 and 1.0. (B) ROC curve AUC=0.715, first-session features only. (C) 5-Event Wall: churn rate versus event types in first session. (D) ASI components delta-H and alpha for retained versus churned users.</w:t>
+      </w:r>
+    </w:p>
+    <w:p>
       <w:pPr>
         <w:spacing w:after="0" w:line="480"/>
       </w:pPr>
@@ -3764,6 +3800,20 @@
         <w:spacing w:after="120" w:before="480" w:line="480"/>
       </w:pPr>
       <w:r>
+        <w:t>Funding</w:t>
+      </w:r>
+    </w:p>
+    <w:p>
+      <w:r>
+        <w:t>This work was supported by no external funding. The research was conducted independently under Fractal Core Research, Tlaxcala, Mexico. All data sources are publicly available (Maddison Project Database 2023, INEGI, HackerEarth 2026, WHO GLASS 2022). No article processing charge is required for submission to Journal of Complex Networks.</w:t>
+      </w:r>
+    </w:p>
+    <w:p>
+      <w:pPr>
+        <w:pStyle w:val="Heading1"/>
+        <w:spacing w:after="120" w:before="480" w:line="480"/>
+      </w:pPr>
+      <w:r>
         <w:rPr>
           <w:rFonts w:ascii="Times New Roman" w:cs="Times New Roman" w:eastAsia="Times New Roman" w:hAnsi="Times New Roman"/>
           <w:b/>
@@ -3932,7 +3982,7 @@
           <w:sz w:val="24"/>
           <w:szCs w:val="24"/>
         </w:rPr>
-        <w:t xml:space="preserve">[4] Zainos Corona E. Shadow Node Theory v2.3.1 — Replication Package. Zenodo. 2026. DOI: 10.5281/zenodo.19446521</w:t>
+        <w:t>[4] [dataset] Zainos Corona E. Shadow Node Theory v2.3.1 — Replication Package. Zenodo. 2026. DOI: 10.5281/zenodo.19446521</w:t>
       </w:r>
     </w:p>
     <w:p>

</xml_diff>